<commit_message>
Make the assignment document ready to hand in
Adds docgen/finalize.py, run by `make doc` after build_doc.py. It puts the
student's name and date under the title and in the author fields, sets the
SQL blocks one point smaller so the longest lines no longer wrap, splits the
Part IV account into a heading and paragraphs with bold lead-ins, and makes
the website and repository addresses clickable.

Part IV text: drop the one-to-three-second response claim and describe the
model fallback instead. Ignore Word lock files.

Co-Authored-By: Claude Opus 5.5 <noreply@anthropic.com>
</commit_message>
<xml_diff>
--- a/Analytics_mindset_PCard_assignment_COMPLETED.docx
+++ b/Analytics_mindset_PCard_assignment_COMPLETED.docx
@@ -60,6 +60,26 @@
           <w:szCs w:val="20"/>
         </w:rPr>
         <w:t>ard</w:t>
+      </w:r>
+    </w:p>
+    <w:p>
+      <w:pPr>
+        <w:spacing w:after="120" w:line="280" w:lineRule="atLeast"/>
+        <w:jc w:val="center"/>
+        <w:rPr>
+          <w:rFonts w:ascii="Arial" w:hAnsi="Arial" w:cs="Arial"/>
+          <w:b/>
+          <w:sz w:val="20"/>
+          <w:szCs w:val="20"/>
+        </w:rPr>
+      </w:pPr>
+      <w:r>
+        <w:rPr>
+          <w:rFonts w:ascii="Arial" w:hAnsi="Arial" w:cs="Arial"/>
+          <w:sz w:val="20"/>
+          <w:szCs w:val="20"/>
+        </w:rPr>
+        <w:t xml:space="preserve">Submitted by Amir Arnautovic  ·  29 October 2026</w:t>
       </w:r>
     </w:p>
     <w:p>
@@ -9280,8 +9300,16 @@
         </w:rPr>
       </w:pPr>
       <w:r>
-        <w:t xml:space="preserve">A link to your live website:  https://pcard-audit-workbench.onrender.com</w:t>
-      </w:r>
+        <w:t xml:space="preserve">A link to your live website:  </w:t>
+      </w:r>
+      <w:hyperlink r:id="rIdSubmitLink1" w:history="1">
+        <w:r>
+          <w:rPr>
+            <w:rStyle w:val="Hyperlink"/>
+          </w:rPr>
+          <w:t xml:space="preserve">https://pcard-audit-workbench.onrender.com</w:t>
+        </w:r>
+      </w:hyperlink>
     </w:p>
     <w:p>
       <w:pPr>
@@ -9299,8 +9327,16 @@
         </w:rPr>
       </w:pPr>
       <w:r>
-        <w:t xml:space="preserve">A link to your GitHub repository:  https://github.com/AmirA210703/pcard-audit</w:t>
-      </w:r>
+        <w:t xml:space="preserve">A link to your GitHub repository:  </w:t>
+      </w:r>
+      <w:hyperlink r:id="rIdSubmitLink2" w:history="1">
+        <w:r>
+          <w:rPr>
+            <w:rStyle w:val="Hyperlink"/>
+          </w:rPr>
+          <w:t xml:space="preserve">https://github.com/AmirA210703/pcard-audit</w:t>
+        </w:r>
+      </w:hyperlink>
     </w:p>
     <w:p>
       <w:pPr>
@@ -9314,24 +9350,105 @@
       </w:pPr>
       <w:r>
         <w:t xml:space="preserve">Important — protect your API key: Do not place your API key in your source code or upload it to GitHub. Submitting an exposed API key will result in a substantial grading penalty.</w:t>
-        <w:br/>
-        <w:br/>
+      </w:r>
+    </w:p>
+    <w:p>
+      <w:pPr>
+        <w:pStyle w:val="ControlBlockTitle"/>
+      </w:pPr>
+      <w:r>
         <w:t xml:space="preserve">Part IV — what was built</w:t>
-        <w:br/>
-        <w:br/>
-        <w:t xml:space="preserve">The P-Card Audit Workbench is a two-tab Flask application deployed at https://pcard-audit-workbench.onrender.com, with the source at https://github.com/AmirA210703/pcard-audit. It is served on a free hosting plan that suspends the service after 15 minutes of inactivity, so the first request after an idle period takes roughly 40 seconds while the instance restarts; subsequent questions answer in one to three seconds.</w:t>
-        <w:br/>
-        <w:br/>
-        <w:t xml:space="preserve">Tab 1 — Ask the data. The auditor types a question in plain language. The question and the table definition, and nothing else, are sent to a language model, which returns a single SQLite SELECT. The server executes that query itself and displays the result together with the query and a plain-language explanation, so the logic can be checked before the answer is relied upon. No transaction data is ever sent to the model. Three of the assignment's own tests were reproduced through this tab as a check on the translation: 457 cardholder-months over $10,000 (Control 2), 33 transactions over $5,000 (Control 3), and 269 charges between $4,500 and $4,999.99 (Part III Question 5).</w:t>
-        <w:br/>
-        <w:br/>
-        <w:t xml:space="preserve">Tab 2 — Prohibited purchases. The dashboard opens with numbered instructions. A year selector covers 2010 to 2014 and defaults to the audit year. The description search and the vendor search are presented as two separate, colour-coded panels with their own labels, help text and buttons, so it is always clear which field is being searched. All fourteen prohibited categories from the procedure above are listed with pre-loaded search terms, and each category can be searched one term at a time or in full with a single click. Results carry the transaction detail needed for follow-up — dates, cardholder, vendor, description, amount and MCC — with sortable columns, a minimum-amount filter, a spend-by-month chart over the whole matching population, an explicit marker on any charge above the $5,000 single-transaction limit, and CSV export for the working papers. Each category also records the false positives found when the 2014 data was tested, because a keyword hit is a lead and not a finding.</w:t>
-        <w:br/>
-        <w:br/>
-        <w:t xml:space="preserve">Protecting the API key. The key is never in the repository. It is read from an environment variable at run time, held as an encrypted secret by the hosting platform and injected only into the running process, and it is never sent to the browser — the model is called server-side, so the key appears in no page source and in no network request the user can see. Locally it lives in a .env file that is listed in .gitignore. A check_secrets.sh script is installed as a git pre-commit hook and refuses any commit containing a string shaped like a real key, or any commit that would track a .env file; it ran on every commit in this repository's history. The published repository was also scanned for key patterns after publication, and is clean.</w:t>
-        <w:br/>
-        <w:br/>
-        <w:t xml:space="preserve">Read-only by construction. The database connection is opened in read-only mode, so no request can alter the evidence file. Every generated query must additionally pass a guard that accepts a single SELECT or WITH ... SELECT and rejects INSERT, UPDATE, DELETE, DROP, ALTER, CREATE, ATTACH and PRAGMA; a query still running after 20 seconds is stopped. Dashboard keyword searches are parameter-bound, so a keyword such as %' OR 1=1 -- is treated as literal text and never as SQL.</w:t>
+      </w:r>
+    </w:p>
+    <w:p>
+      <w:pPr>
+        <w:pStyle w:val="ControlFieldText"/>
+        <w:spacing w:after="120"/>
+      </w:pPr>
+      <w:r>
+        <w:t xml:space="preserve">The P-Card Audit Workbench is a two-tab Flask application deployed at </w:t>
+      </w:r>
+      <w:hyperlink r:id="rIdSubmitLink1" w:history="1">
+        <w:r>
+          <w:rPr>
+            <w:rStyle w:val="Hyperlink"/>
+          </w:rPr>
+          <w:t xml:space="preserve">https://pcard-audit-workbench.onrender.com</w:t>
+        </w:r>
+      </w:hyperlink>
+      <w:r>
+        <w:t xml:space="preserve">, with the source at </w:t>
+      </w:r>
+      <w:hyperlink r:id="rIdSubmitLink2" w:history="1">
+        <w:r>
+          <w:rPr>
+            <w:rStyle w:val="Hyperlink"/>
+          </w:rPr>
+          <w:t xml:space="preserve">https://github.com/AmirA210703/pcard-audit</w:t>
+        </w:r>
+      </w:hyperlink>
+      <w:r>
+        <w:t xml:space="preserve">. It is served on a free hosting plan that suspends the service after 15 minutes of inactivity, so the first request after an idle period takes roughly 40 seconds while the instance restarts.</w:t>
+      </w:r>
+    </w:p>
+    <w:p>
+      <w:pPr>
+        <w:pStyle w:val="ControlFieldText"/>
+        <w:spacing w:after="120"/>
+      </w:pPr>
+      <w:r>
+        <w:rPr>
+          <w:b/>
+        </w:rPr>
+        <w:t xml:space="preserve">Tab 1 — Ask the data.</w:t>
+      </w:r>
+      <w:r>
+        <w:t xml:space="preserve"> The auditor types a question in plain language. The question and the table definition, and nothing else, are sent to a language model, which returns a single SQLite SELECT. The server executes that query itself and displays the result together with the query and a plain-language explanation, so the logic can be checked before the answer is relied upon. No transaction data is ever sent to the model. Free-tier model capacity varies by the hour, so the server does not depend on one model: a model that is busy hands over to the next at once, a slow one is raced against the next after four seconds, and the model that answered last is tried first on the next question. Three of the assignment's own tests were reproduced through this tab as a check on the translation: 457 cardholder-months over $10,000 (Control 2), 33 transactions over $5,000 (Control 3), and 269 charges between $4,500 and $4,999.99 (Part III Question 5).</w:t>
+      </w:r>
+    </w:p>
+    <w:p>
+      <w:pPr>
+        <w:pStyle w:val="ControlFieldText"/>
+        <w:spacing w:after="120"/>
+      </w:pPr>
+      <w:r>
+        <w:rPr>
+          <w:b/>
+        </w:rPr>
+        <w:t xml:space="preserve">Tab 2 — Prohibited purchases.</w:t>
+      </w:r>
+      <w:r>
+        <w:t xml:space="preserve"> The dashboard opens with numbered instructions. A year selector covers 2010 to 2014 and defaults to the audit year. The description search and the vendor search are presented as two separate, colour-coded panels with their own labels, help text and buttons, so it is always clear which field is being searched. All fourteen prohibited categories from the procedure above are listed with pre-loaded search terms, and each category can be searched one term at a time or in full with a single click. Results carry the transaction detail needed for follow-up — dates, cardholder, vendor, description, amount and MCC — with sortable columns, a minimum-amount filter, a spend-by-month chart over the whole matching population, an explicit marker on any charge above the $5,000 single-transaction limit, and CSV export for the working papers. Each category also records the false positives found when the 2014 data was tested, because a keyword hit is a lead and not a finding.</w:t>
+      </w:r>
+    </w:p>
+    <w:p>
+      <w:pPr>
+        <w:pStyle w:val="ControlFieldText"/>
+        <w:spacing w:after="120"/>
+      </w:pPr>
+      <w:r>
+        <w:rPr>
+          <w:b/>
+        </w:rPr>
+        <w:t xml:space="preserve">Protecting the API key.</w:t>
+      </w:r>
+      <w:r>
+        <w:t xml:space="preserve"> The key is never in the repository. It is read from an environment variable at run time, held as an encrypted secret by the hosting platform and injected only into the running process, and it is never sent to the browser — the model is called server-side, so the key appears in no page source and in no network request the user can see. Locally it lives in a .env file that is listed in .gitignore. A check_secrets.sh script is installed as a git pre-commit hook and refuses any commit containing a string shaped like a real key, or any commit that would track a .env file; it ran on every commit in this repository's history. The published repository was also scanned for key patterns after publication, and is clean.</w:t>
+      </w:r>
+    </w:p>
+    <w:p>
+      <w:pPr>
+        <w:pStyle w:val="ControlFieldText"/>
+        <w:spacing w:after="120"/>
+      </w:pPr>
+      <w:r>
+        <w:rPr>
+          <w:b/>
+        </w:rPr>
+        <w:t xml:space="preserve">Read-only by construction.</w:t>
+      </w:r>
+      <w:r>
+        <w:t xml:space="preserve"> The database connection is opened in read-only mode, so no request can alter the evidence file. Every generated query must additionally pass a guard that accepts a single SELECT or WITH ... SELECT and rejects INSERT, UPDATE, DELETE, DROP, ALTER, CREATE, ATTACH and PRAGMA; a query still running after 20 seconds is stopped. Dashboard keyword searches are parameter-bound, so a keyword such as %' OR 1=1 -- is treated as literal text and never as SQL.</w:t>
       </w:r>
     </w:p>
     <w:sectPr>
@@ -19718,7 +19835,7 @@
     </w:pPr>
     <w:rPr>
       <w:rFonts w:ascii="Consolas" w:hAnsi="Consolas"/>
-      <w:sz w:val="18"/>
+      <w:sz w:val="16"/>
     </w:rPr>
   </w:style>
   <w:style w:type="paragraph" w:customStyle="1" w:styleId="ResultPlaceholder">

</xml_diff>